<commit_message>
docs: fill in Zenodo DOI 10.5281/zenodo.19718086 across README and papers
</commit_message>
<xml_diff>
--- a/paper/paper_en_v1.docx
+++ b/paper/paper_en_v1.docx
@@ -13797,7 +13797,20 @@
           <w:rFonts w:ascii="Times New Roman" w:hAnsi="Times New Roman"/>
           <w:sz w:val="22"/>
         </w:rPr>
-        <w:t>GitHub repository: (pending release)</w:t>
+        <w:t>GitHub repository: https://github.com/dairongzhen3-creator/math-language-cross-section</w:t>
+      </w:r>
+    </w:p>
+    <w:p>
+      <w:pPr>
+        <w:spacing w:line="336" w:lineRule="auto"/>
+        <w:ind w:firstLine="283"/>
+      </w:pPr>
+      <w:r>
+        <w:rPr>
+          <w:rFonts w:ascii="Times New Roman" w:hAnsi="Times New Roman"/>
+          <w:sz w:val="22"/>
+        </w:rPr>
+        <w:t>Zenodo DOI: [10.5281/zenodo.19718086](https://doi.org/10.5281/zenodo.19718086)</w:t>
       </w:r>
     </w:p>
     <w:p>

</xml_diff>